<commit_message>
Adding latest changes (including sentences notebook file and db import
</commit_message>
<xml_diff>
--- a/docs/Sentence.docx
+++ b/docs/Sentence.docx
@@ -43,39 +43,49 @@
             <w:tcW w:w="3237" w:type="dxa"/>
           </w:tcPr>
           <w:p>
+            <w:proofErr w:type="spellStart"/>
             <w:r>
               <w:rPr>
                 <w:rFonts w:ascii="Iskoola Pota" w:hAnsi="Iskoola Pota" w:cs="Iskoola Pota"/>
               </w:rPr>
               <w:t>ඔහු</w:t>
             </w:r>
-            <w:r>
-              <w:t xml:space="preserve"> </w:t>
-            </w:r>
+            <w:proofErr w:type="spellEnd"/>
+            <w:r>
+              <w:t xml:space="preserve"> </w:t>
+            </w:r>
+            <w:proofErr w:type="spellStart"/>
             <w:r>
               <w:rPr>
                 <w:rFonts w:ascii="Iskoola Pota" w:hAnsi="Iskoola Pota" w:cs="Iskoola Pota"/>
               </w:rPr>
               <w:t>ගසේ</w:t>
             </w:r>
-            <w:r>
-              <w:t xml:space="preserve"> </w:t>
-            </w:r>
-            <w:r>
-              <w:rPr>
-                <w:rFonts w:ascii="Iskoola Pota" w:hAnsi="Iskoola Pota" w:cs="Iskoola Pota"/>
+            <w:proofErr w:type="spellEnd"/>
+            <w:r>
+              <w:t xml:space="preserve"> </w:t>
+            </w:r>
+            <w:proofErr w:type="spellStart"/>
+            <w:r>
+              <w:rPr>
+                <w:rFonts w:ascii="Iskoola Pota" w:hAnsi="Iskoola Pota" w:cs="Iskoola Pota"/>
+                <w:b/>
+                <w:bCs/>
               </w:rPr>
               <w:t>මල</w:t>
             </w:r>
-            <w:r>
-              <w:t xml:space="preserve"> </w:t>
-            </w:r>
+            <w:proofErr w:type="spellEnd"/>
+            <w:r>
+              <w:t xml:space="preserve"> </w:t>
+            </w:r>
+            <w:proofErr w:type="spellStart"/>
             <w:r>
               <w:rPr>
                 <w:rFonts w:ascii="Iskoola Pota" w:hAnsi="Iskoola Pota" w:cs="Iskoola Pota"/>
               </w:rPr>
               <w:t>කැඩුවා</w:t>
             </w:r>
+            <w:proofErr w:type="spellEnd"/>
           </w:p>
           <w:p>
             <w:pPr>
@@ -90,39 +100,49 @@
             <w:tcW w:w="3237" w:type="dxa"/>
           </w:tcPr>
           <w:p>
+            <w:proofErr w:type="spellStart"/>
             <w:r>
               <w:rPr>
                 <w:rFonts w:ascii="Iskoola Pota" w:hAnsi="Iskoola Pota" w:cs="Iskoola Pota"/>
               </w:rPr>
               <w:t>ඔහු</w:t>
             </w:r>
-            <w:r>
-              <w:t xml:space="preserve"> </w:t>
-            </w:r>
+            <w:proofErr w:type="spellEnd"/>
+            <w:r>
+              <w:t xml:space="preserve"> </w:t>
+            </w:r>
+            <w:proofErr w:type="spellStart"/>
             <w:r>
               <w:rPr>
                 <w:rFonts w:ascii="Iskoola Pota" w:hAnsi="Iskoola Pota" w:cs="Iskoola Pota"/>
               </w:rPr>
               <w:t>ගසේ</w:t>
             </w:r>
-            <w:r>
-              <w:t xml:space="preserve"> </w:t>
-            </w:r>
-            <w:r>
-              <w:rPr>
-                <w:rFonts w:ascii="Iskoola Pota" w:hAnsi="Iskoola Pota" w:cs="Iskoola Pota"/>
+            <w:proofErr w:type="spellEnd"/>
+            <w:r>
+              <w:t xml:space="preserve"> </w:t>
+            </w:r>
+            <w:proofErr w:type="spellStart"/>
+            <w:r>
+              <w:rPr>
+                <w:rFonts w:ascii="Iskoola Pota" w:hAnsi="Iskoola Pota" w:cs="Iskoola Pota"/>
+                <w:b/>
+                <w:bCs/>
               </w:rPr>
               <w:t>මුල</w:t>
             </w:r>
-            <w:r>
-              <w:t xml:space="preserve"> </w:t>
-            </w:r>
+            <w:proofErr w:type="spellEnd"/>
+            <w:r>
+              <w:t xml:space="preserve"> </w:t>
+            </w:r>
+            <w:proofErr w:type="spellStart"/>
             <w:r>
               <w:rPr>
                 <w:rFonts w:ascii="Iskoola Pota" w:hAnsi="Iskoola Pota" w:cs="Iskoola Pota"/>
               </w:rPr>
               <w:t>කැඩුවා</w:t>
             </w:r>
+            <w:proofErr w:type="spellEnd"/>
           </w:p>
         </w:tc>
       </w:tr>
@@ -156,39 +176,49 @@
             <w:tcW w:w="3237" w:type="dxa"/>
           </w:tcPr>
           <w:p>
+            <w:proofErr w:type="spellStart"/>
             <w:r>
               <w:rPr>
                 <w:rFonts w:ascii="Iskoola Pota" w:hAnsi="Iskoola Pota" w:cs="Iskoola Pota"/>
               </w:rPr>
               <w:t>නංගී</w:t>
             </w:r>
-            <w:r>
-              <w:t xml:space="preserve"> </w:t>
-            </w:r>
-            <w:r>
-              <w:rPr>
-                <w:rFonts w:ascii="Iskoola Pota" w:hAnsi="Iskoola Pota" w:cs="Iskoola Pota"/>
+            <w:proofErr w:type="spellEnd"/>
+            <w:r>
+              <w:t xml:space="preserve"> </w:t>
+            </w:r>
+            <w:proofErr w:type="spellStart"/>
+            <w:r>
+              <w:rPr>
+                <w:rFonts w:ascii="Iskoola Pota" w:hAnsi="Iskoola Pota" w:cs="Iskoola Pota"/>
+                <w:b/>
+                <w:bCs/>
               </w:rPr>
               <w:t>කජු</w:t>
             </w:r>
-            <w:r>
-              <w:t xml:space="preserve"> </w:t>
-            </w:r>
+            <w:proofErr w:type="spellEnd"/>
+            <w:r>
+              <w:t xml:space="preserve"> </w:t>
+            </w:r>
+            <w:proofErr w:type="spellStart"/>
             <w:r>
               <w:rPr>
                 <w:rFonts w:ascii="Iskoola Pota" w:hAnsi="Iskoola Pota" w:cs="Iskoola Pota"/>
               </w:rPr>
               <w:t>කන්න</w:t>
             </w:r>
-            <w:r>
-              <w:t xml:space="preserve"> </w:t>
-            </w:r>
+            <w:proofErr w:type="spellEnd"/>
+            <w:r>
+              <w:t xml:space="preserve"> </w:t>
+            </w:r>
+            <w:proofErr w:type="spellStart"/>
             <w:r>
               <w:rPr>
                 <w:rFonts w:ascii="Iskoola Pota" w:hAnsi="Iskoola Pota" w:cs="Iskoola Pota"/>
               </w:rPr>
               <w:t>ආසයි</w:t>
             </w:r>
+            <w:proofErr w:type="spellEnd"/>
           </w:p>
           <w:p>
             <w:pPr>
@@ -203,39 +233,49 @@
             <w:tcW w:w="3237" w:type="dxa"/>
           </w:tcPr>
           <w:p>
+            <w:proofErr w:type="spellStart"/>
             <w:r>
               <w:rPr>
                 <w:rFonts w:ascii="Iskoola Pota" w:hAnsi="Iskoola Pota" w:cs="Iskoola Pota"/>
               </w:rPr>
               <w:t>නංගී</w:t>
             </w:r>
-            <w:r>
-              <w:t xml:space="preserve"> </w:t>
-            </w:r>
-            <w:r>
-              <w:rPr>
-                <w:rFonts w:ascii="Iskoola Pota" w:hAnsi="Iskoola Pota" w:cs="Iskoola Pota"/>
+            <w:proofErr w:type="spellEnd"/>
+            <w:r>
+              <w:t xml:space="preserve"> </w:t>
+            </w:r>
+            <w:proofErr w:type="spellStart"/>
+            <w:r>
+              <w:rPr>
+                <w:rFonts w:ascii="Iskoola Pota" w:hAnsi="Iskoola Pota" w:cs="Iskoola Pota"/>
+                <w:b/>
+                <w:bCs/>
               </w:rPr>
               <w:t>කේජු</w:t>
             </w:r>
-            <w:r>
-              <w:t xml:space="preserve"> </w:t>
-            </w:r>
+            <w:proofErr w:type="spellEnd"/>
+            <w:r>
+              <w:t xml:space="preserve"> </w:t>
+            </w:r>
+            <w:proofErr w:type="spellStart"/>
             <w:r>
               <w:rPr>
                 <w:rFonts w:ascii="Iskoola Pota" w:hAnsi="Iskoola Pota" w:cs="Iskoola Pota"/>
               </w:rPr>
               <w:t>කන්න</w:t>
             </w:r>
-            <w:r>
-              <w:t xml:space="preserve"> </w:t>
-            </w:r>
+            <w:proofErr w:type="spellEnd"/>
+            <w:r>
+              <w:t xml:space="preserve"> </w:t>
+            </w:r>
+            <w:proofErr w:type="spellStart"/>
             <w:r>
               <w:rPr>
                 <w:rFonts w:ascii="Iskoola Pota" w:hAnsi="Iskoola Pota" w:cs="Iskoola Pota"/>
               </w:rPr>
               <w:t>ආසයි</w:t>
             </w:r>
+            <w:proofErr w:type="spellEnd"/>
           </w:p>
           <w:p>
             <w:pPr>
@@ -276,30 +316,38 @@
             <w:tcW w:w="3237" w:type="dxa"/>
           </w:tcPr>
           <w:p>
+            <w:proofErr w:type="spellStart"/>
             <w:r>
               <w:rPr>
                 <w:rFonts w:ascii="Iskoola Pota" w:hAnsi="Iskoola Pota" w:cs="Iskoola Pota"/>
               </w:rPr>
               <w:t>එතන</w:t>
             </w:r>
-            <w:r>
-              <w:t xml:space="preserve"> </w:t>
-            </w:r>
-            <w:r>
-              <w:rPr>
-                <w:rFonts w:ascii="Iskoola Pota" w:hAnsi="Iskoola Pota" w:cs="Iskoola Pota"/>
+            <w:proofErr w:type="spellEnd"/>
+            <w:r>
+              <w:t xml:space="preserve"> </w:t>
+            </w:r>
+            <w:proofErr w:type="spellStart"/>
+            <w:r>
+              <w:rPr>
+                <w:rFonts w:ascii="Iskoola Pota" w:hAnsi="Iskoola Pota" w:cs="Iskoola Pota"/>
+                <w:b/>
+                <w:bCs/>
               </w:rPr>
               <w:t>වලක්</w:t>
             </w:r>
-            <w:r>
-              <w:t xml:space="preserve"> </w:t>
-            </w:r>
+            <w:proofErr w:type="spellEnd"/>
+            <w:r>
+              <w:t xml:space="preserve"> </w:t>
+            </w:r>
+            <w:proofErr w:type="spellStart"/>
             <w:r>
               <w:rPr>
                 <w:rFonts w:ascii="Iskoola Pota" w:hAnsi="Iskoola Pota" w:cs="Iskoola Pota"/>
               </w:rPr>
               <w:t>තියනවා</w:t>
             </w:r>
+            <w:proofErr w:type="spellEnd"/>
           </w:p>
           <w:p>
             <w:pPr>
@@ -314,30 +362,38 @@
             <w:tcW w:w="3237" w:type="dxa"/>
           </w:tcPr>
           <w:p>
+            <w:proofErr w:type="spellStart"/>
             <w:r>
               <w:rPr>
                 <w:rFonts w:ascii="Iskoola Pota" w:hAnsi="Iskoola Pota" w:cs="Iskoola Pota"/>
               </w:rPr>
               <w:t>එතන</w:t>
             </w:r>
-            <w:r>
-              <w:t xml:space="preserve"> </w:t>
-            </w:r>
-            <w:r>
-              <w:rPr>
-                <w:rFonts w:ascii="Iskoola Pota" w:hAnsi="Iskoola Pota" w:cs="Iskoola Pota"/>
+            <w:proofErr w:type="spellEnd"/>
+            <w:r>
+              <w:t xml:space="preserve"> </w:t>
+            </w:r>
+            <w:proofErr w:type="spellStart"/>
+            <w:r>
+              <w:rPr>
+                <w:rFonts w:ascii="Iskoola Pota" w:hAnsi="Iskoola Pota" w:cs="Iskoola Pota"/>
+                <w:b/>
+                <w:bCs/>
               </w:rPr>
               <w:t>විලක්</w:t>
             </w:r>
-            <w:r>
-              <w:t xml:space="preserve"> </w:t>
-            </w:r>
+            <w:proofErr w:type="spellEnd"/>
+            <w:r>
+              <w:t xml:space="preserve"> </w:t>
+            </w:r>
+            <w:proofErr w:type="spellStart"/>
             <w:r>
               <w:rPr>
                 <w:rFonts w:ascii="Iskoola Pota" w:hAnsi="Iskoola Pota" w:cs="Iskoola Pota"/>
               </w:rPr>
               <w:t>තියනවා</w:t>
             </w:r>
+            <w:proofErr w:type="spellEnd"/>
           </w:p>
           <w:p>
             <w:pPr>
@@ -378,30 +434,38 @@
             <w:tcW w:w="3237" w:type="dxa"/>
           </w:tcPr>
           <w:p>
+            <w:proofErr w:type="spellStart"/>
             <w:r>
               <w:rPr>
                 <w:rFonts w:ascii="Iskoola Pota" w:hAnsi="Iskoola Pota" w:cs="Iskoola Pota"/>
               </w:rPr>
               <w:t>ගෝනියේ</w:t>
             </w:r>
-            <w:r>
-              <w:t xml:space="preserve"> </w:t>
-            </w:r>
-            <w:r>
-              <w:rPr>
-                <w:rFonts w:ascii="Iskoola Pota" w:hAnsi="Iskoola Pota" w:cs="Iskoola Pota"/>
+            <w:proofErr w:type="spellEnd"/>
+            <w:r>
+              <w:t xml:space="preserve"> </w:t>
+            </w:r>
+            <w:proofErr w:type="spellStart"/>
+            <w:r>
+              <w:rPr>
+                <w:rFonts w:ascii="Iskoola Pota" w:hAnsi="Iskoola Pota" w:cs="Iskoola Pota"/>
+                <w:b/>
+                <w:bCs/>
               </w:rPr>
               <w:t>හාල්</w:t>
             </w:r>
-            <w:r>
-              <w:t xml:space="preserve"> </w:t>
-            </w:r>
+            <w:proofErr w:type="spellEnd"/>
+            <w:r>
+              <w:t xml:space="preserve"> </w:t>
+            </w:r>
+            <w:proofErr w:type="spellStart"/>
             <w:r>
               <w:rPr>
                 <w:rFonts w:ascii="Iskoola Pota" w:hAnsi="Iskoola Pota" w:cs="Iskoola Pota"/>
               </w:rPr>
               <w:t>තියෙනවා</w:t>
             </w:r>
+            <w:proofErr w:type="spellEnd"/>
           </w:p>
           <w:p>
             <w:pPr>
@@ -416,30 +480,38 @@
             <w:tcW w:w="3237" w:type="dxa"/>
           </w:tcPr>
           <w:p>
+            <w:proofErr w:type="spellStart"/>
             <w:r>
               <w:rPr>
                 <w:rFonts w:ascii="Iskoola Pota" w:hAnsi="Iskoola Pota" w:cs="Iskoola Pota"/>
               </w:rPr>
               <w:t>ගෝනියේ</w:t>
             </w:r>
-            <w:r>
-              <w:t xml:space="preserve"> </w:t>
-            </w:r>
-            <w:r>
-              <w:rPr>
-                <w:rFonts w:ascii="Iskoola Pota" w:hAnsi="Iskoola Pota" w:cs="Iskoola Pota"/>
+            <w:proofErr w:type="spellEnd"/>
+            <w:r>
+              <w:t xml:space="preserve"> </w:t>
+            </w:r>
+            <w:proofErr w:type="spellStart"/>
+            <w:r>
+              <w:rPr>
+                <w:rFonts w:ascii="Iskoola Pota" w:hAnsi="Iskoola Pota" w:cs="Iskoola Pota"/>
+                <w:b/>
+                <w:bCs/>
               </w:rPr>
               <w:t>හිල්</w:t>
             </w:r>
-            <w:r>
-              <w:t xml:space="preserve"> </w:t>
-            </w:r>
+            <w:proofErr w:type="spellEnd"/>
+            <w:r>
+              <w:t xml:space="preserve"> </w:t>
+            </w:r>
+            <w:proofErr w:type="spellStart"/>
             <w:r>
               <w:rPr>
                 <w:rFonts w:ascii="Iskoola Pota" w:hAnsi="Iskoola Pota" w:cs="Iskoola Pota"/>
               </w:rPr>
               <w:t>තියෙනවා</w:t>
             </w:r>
+            <w:proofErr w:type="spellEnd"/>
           </w:p>
           <w:p>
             <w:pPr>
@@ -480,30 +552,38 @@
             <w:tcW w:w="3237" w:type="dxa"/>
           </w:tcPr>
           <w:p>
+            <w:proofErr w:type="spellStart"/>
             <w:r>
               <w:rPr>
                 <w:rFonts w:ascii="Iskoola Pota" w:hAnsi="Iskoola Pota" w:cs="Iskoola Pota"/>
               </w:rPr>
               <w:t>තාත්තා</w:t>
             </w:r>
-            <w:r>
-              <w:t xml:space="preserve"> </w:t>
-            </w:r>
-            <w:r>
-              <w:rPr>
-                <w:rFonts w:ascii="Iskoola Pota" w:hAnsi="Iskoola Pota" w:cs="Iskoola Pota"/>
+            <w:proofErr w:type="spellEnd"/>
+            <w:r>
+              <w:t xml:space="preserve"> </w:t>
+            </w:r>
+            <w:proofErr w:type="spellStart"/>
+            <w:r>
+              <w:rPr>
+                <w:rFonts w:ascii="Iskoola Pota" w:hAnsi="Iskoola Pota" w:cs="Iskoola Pota"/>
+                <w:b/>
+                <w:bCs/>
               </w:rPr>
               <w:t>කුඩයක්</w:t>
             </w:r>
-            <w:r>
-              <w:t xml:space="preserve"> </w:t>
-            </w:r>
+            <w:proofErr w:type="spellEnd"/>
+            <w:r>
+              <w:t xml:space="preserve"> </w:t>
+            </w:r>
+            <w:proofErr w:type="spellStart"/>
             <w:r>
               <w:rPr>
                 <w:rFonts w:ascii="Iskoola Pota" w:hAnsi="Iskoola Pota" w:cs="Iskoola Pota"/>
               </w:rPr>
               <w:t>ගෙනවා</w:t>
             </w:r>
+            <w:proofErr w:type="spellEnd"/>
           </w:p>
           <w:p>
             <w:pPr>
@@ -518,30 +598,38 @@
             <w:tcW w:w="3237" w:type="dxa"/>
           </w:tcPr>
           <w:p>
+            <w:proofErr w:type="spellStart"/>
             <w:r>
               <w:rPr>
                 <w:rFonts w:ascii="Iskoola Pota" w:hAnsi="Iskoola Pota" w:cs="Iskoola Pota"/>
               </w:rPr>
               <w:t>තාත්තා</w:t>
             </w:r>
-            <w:r>
-              <w:t xml:space="preserve"> </w:t>
-            </w:r>
-            <w:r>
-              <w:rPr>
-                <w:rFonts w:ascii="Iskoola Pota" w:hAnsi="Iskoola Pota" w:cs="Iskoola Pota"/>
+            <w:proofErr w:type="spellEnd"/>
+            <w:r>
+              <w:t xml:space="preserve"> </w:t>
+            </w:r>
+            <w:proofErr w:type="spellStart"/>
+            <w:r>
+              <w:rPr>
+                <w:rFonts w:ascii="Iskoola Pota" w:hAnsi="Iskoola Pota" w:cs="Iskoola Pota"/>
+                <w:b/>
+                <w:bCs/>
               </w:rPr>
               <w:t>කූඩයක්</w:t>
             </w:r>
-            <w:r>
-              <w:t xml:space="preserve"> </w:t>
-            </w:r>
+            <w:proofErr w:type="spellEnd"/>
+            <w:r>
+              <w:t xml:space="preserve"> </w:t>
+            </w:r>
+            <w:proofErr w:type="spellStart"/>
             <w:r>
               <w:rPr>
                 <w:rFonts w:ascii="Iskoola Pota" w:hAnsi="Iskoola Pota" w:cs="Iskoola Pota"/>
               </w:rPr>
               <w:t>ගෙනවා</w:t>
             </w:r>
+            <w:proofErr w:type="spellEnd"/>
           </w:p>
           <w:p>
             <w:pPr>
@@ -582,66 +670,82 @@
             <w:tcW w:w="3237" w:type="dxa"/>
           </w:tcPr>
           <w:p>
+            <w:proofErr w:type="spellStart"/>
             <w:r>
               <w:rPr>
                 <w:rFonts w:ascii="Iskoola Pota" w:hAnsi="Iskoola Pota" w:cs="Iskoola Pota"/>
               </w:rPr>
               <w:t>ගිය</w:t>
             </w:r>
-            <w:r>
-              <w:t xml:space="preserve"> </w:t>
-            </w:r>
+            <w:proofErr w:type="spellEnd"/>
+            <w:r>
+              <w:t xml:space="preserve"> </w:t>
+            </w:r>
+            <w:proofErr w:type="spellStart"/>
             <w:r>
               <w:rPr>
                 <w:rFonts w:ascii="Iskoola Pota" w:hAnsi="Iskoola Pota" w:cs="Iskoola Pota"/>
               </w:rPr>
               <w:t>මාසේ</w:t>
             </w:r>
-            <w:r>
-              <w:t xml:space="preserve"> </w:t>
-            </w:r>
+            <w:proofErr w:type="spellEnd"/>
+            <w:r>
+              <w:t xml:space="preserve"> </w:t>
+            </w:r>
+            <w:proofErr w:type="spellStart"/>
             <w:r>
               <w:rPr>
                 <w:rFonts w:ascii="Iskoola Pota" w:hAnsi="Iskoola Pota" w:cs="Iskoola Pota"/>
               </w:rPr>
               <w:t>කඩපු</w:t>
             </w:r>
-            <w:r>
-              <w:t xml:space="preserve"> </w:t>
-            </w:r>
+            <w:proofErr w:type="spellEnd"/>
+            <w:r>
+              <w:t xml:space="preserve"> </w:t>
+            </w:r>
+            <w:proofErr w:type="spellStart"/>
             <w:r>
               <w:rPr>
                 <w:rFonts w:ascii="Iskoola Pota" w:hAnsi="Iskoola Pota" w:cs="Iskoola Pota"/>
               </w:rPr>
               <w:t>තැඹිලි</w:t>
             </w:r>
-            <w:r>
-              <w:t xml:space="preserve"> </w:t>
-            </w:r>
+            <w:proofErr w:type="spellEnd"/>
+            <w:r>
+              <w:t xml:space="preserve"> </w:t>
+            </w:r>
+            <w:proofErr w:type="spellStart"/>
             <w:r>
               <w:rPr>
                 <w:rFonts w:ascii="Iskoola Pota" w:hAnsi="Iskoola Pota" w:cs="Iskoola Pota"/>
               </w:rPr>
               <w:t>ටික</w:t>
             </w:r>
-            <w:r>
-              <w:t xml:space="preserve"> </w:t>
-            </w:r>
-            <w:r>
-              <w:rPr>
-                <w:rFonts w:ascii="Iskoola Pota" w:hAnsi="Iskoola Pota" w:cs="Iskoola Pota"/>
+            <w:proofErr w:type="spellEnd"/>
+            <w:r>
+              <w:t xml:space="preserve"> </w:t>
+            </w:r>
+            <w:proofErr w:type="spellStart"/>
+            <w:r>
+              <w:rPr>
+                <w:rFonts w:ascii="Iskoola Pota" w:hAnsi="Iskoola Pota" w:cs="Iskoola Pota"/>
+                <w:b/>
+                <w:bCs/>
               </w:rPr>
               <w:t>පල්</w:t>
             </w:r>
-            <w:r>
-              <w:t xml:space="preserve"> </w:t>
-            </w:r>
+            <w:proofErr w:type="spellEnd"/>
+            <w:r>
+              <w:t xml:space="preserve"> </w:t>
+            </w:r>
+            <w:proofErr w:type="spellStart"/>
             <w:r>
               <w:rPr>
                 <w:rFonts w:ascii="Iskoola Pota" w:hAnsi="Iskoola Pota" w:cs="Iskoola Pota"/>
               </w:rPr>
               <w:t>වෙලා</w:t>
             </w:r>
+            <w:proofErr w:type="spellEnd"/>
           </w:p>
           <w:p>
             <w:pPr>
@@ -656,66 +760,82 @@
             <w:tcW w:w="3237" w:type="dxa"/>
           </w:tcPr>
           <w:p>
+            <w:proofErr w:type="spellStart"/>
             <w:r>
               <w:rPr>
                 <w:rFonts w:ascii="Iskoola Pota" w:hAnsi="Iskoola Pota" w:cs="Iskoola Pota"/>
               </w:rPr>
               <w:t>ගිය</w:t>
             </w:r>
-            <w:r>
-              <w:t xml:space="preserve"> </w:t>
-            </w:r>
+            <w:proofErr w:type="spellEnd"/>
+            <w:r>
+              <w:t xml:space="preserve"> </w:t>
+            </w:r>
+            <w:proofErr w:type="spellStart"/>
             <w:r>
               <w:rPr>
                 <w:rFonts w:ascii="Iskoola Pota" w:hAnsi="Iskoola Pota" w:cs="Iskoola Pota"/>
               </w:rPr>
               <w:t>මාසේ</w:t>
             </w:r>
-            <w:r>
-              <w:t xml:space="preserve"> </w:t>
-            </w:r>
+            <w:proofErr w:type="spellEnd"/>
+            <w:r>
+              <w:t xml:space="preserve"> </w:t>
+            </w:r>
+            <w:proofErr w:type="spellStart"/>
             <w:r>
               <w:rPr>
                 <w:rFonts w:ascii="Iskoola Pota" w:hAnsi="Iskoola Pota" w:cs="Iskoola Pota"/>
               </w:rPr>
               <w:t>කඩපු</w:t>
             </w:r>
-            <w:r>
-              <w:t xml:space="preserve"> </w:t>
-            </w:r>
+            <w:proofErr w:type="spellEnd"/>
+            <w:r>
+              <w:t xml:space="preserve"> </w:t>
+            </w:r>
+            <w:proofErr w:type="spellStart"/>
             <w:r>
               <w:rPr>
                 <w:rFonts w:ascii="Iskoola Pota" w:hAnsi="Iskoola Pota" w:cs="Iskoola Pota"/>
               </w:rPr>
               <w:t>තැඹිලි</w:t>
             </w:r>
-            <w:r>
-              <w:t xml:space="preserve"> </w:t>
-            </w:r>
+            <w:proofErr w:type="spellEnd"/>
+            <w:r>
+              <w:t xml:space="preserve"> </w:t>
+            </w:r>
+            <w:proofErr w:type="spellStart"/>
             <w:r>
               <w:rPr>
                 <w:rFonts w:ascii="Iskoola Pota" w:hAnsi="Iskoola Pota" w:cs="Iskoola Pota"/>
               </w:rPr>
               <w:t>ටික</w:t>
             </w:r>
-            <w:r>
-              <w:t xml:space="preserve"> </w:t>
-            </w:r>
-            <w:r>
-              <w:rPr>
-                <w:rFonts w:ascii="Iskoola Pota" w:hAnsi="Iskoola Pota" w:cs="Iskoola Pota"/>
+            <w:proofErr w:type="spellEnd"/>
+            <w:r>
+              <w:t xml:space="preserve"> </w:t>
+            </w:r>
+            <w:proofErr w:type="spellStart"/>
+            <w:r>
+              <w:rPr>
+                <w:rFonts w:ascii="Iskoola Pota" w:hAnsi="Iskoola Pota" w:cs="Iskoola Pota"/>
+                <w:b/>
+                <w:bCs/>
               </w:rPr>
               <w:t>පොල්</w:t>
             </w:r>
-            <w:r>
-              <w:t xml:space="preserve"> </w:t>
-            </w:r>
+            <w:proofErr w:type="spellEnd"/>
+            <w:r>
+              <w:t xml:space="preserve"> </w:t>
+            </w:r>
+            <w:proofErr w:type="spellStart"/>
             <w:r>
               <w:rPr>
                 <w:rFonts w:ascii="Iskoola Pota" w:hAnsi="Iskoola Pota" w:cs="Iskoola Pota"/>
               </w:rPr>
               <w:t>වෙලා</w:t>
             </w:r>
+            <w:proofErr w:type="spellEnd"/>
           </w:p>
           <w:p>
             <w:pPr>
@@ -734,7 +854,7 @@
           <w:p>
             <w:pPr>
               <w:rPr>
-                <w:rFonts w:ascii="Iskoola Pota" w:hAnsi="Iskoola Pota" w:cs="Iskoola Pota" w:hint="cs"/>
+                <w:rFonts w:ascii="Iskoola Pota" w:hAnsi="Iskoola Pota" w:cs="Iskoola Pota"/>
               </w:rPr>
             </w:pPr>
             <w:r>
@@ -756,30 +876,38 @@
             <w:tcW w:w="3237" w:type="dxa"/>
           </w:tcPr>
           <w:p>
+            <w:proofErr w:type="spellStart"/>
             <w:r>
               <w:rPr>
                 <w:rFonts w:ascii="Iskoola Pota" w:hAnsi="Iskoola Pota" w:cs="Iskoola Pota"/>
               </w:rPr>
               <w:t>මල්ලී</w:t>
             </w:r>
-            <w:r>
-              <w:t xml:space="preserve"> </w:t>
-            </w:r>
-            <w:r>
-              <w:rPr>
-                <w:rFonts w:ascii="Iskoola Pota" w:hAnsi="Iskoola Pota" w:cs="Iskoola Pota"/>
+            <w:proofErr w:type="spellEnd"/>
+            <w:r>
+              <w:t xml:space="preserve"> </w:t>
+            </w:r>
+            <w:proofErr w:type="spellStart"/>
+            <w:r>
+              <w:rPr>
+                <w:rFonts w:ascii="Iskoola Pota" w:hAnsi="Iskoola Pota" w:cs="Iskoola Pota"/>
+                <w:b/>
+                <w:bCs/>
               </w:rPr>
               <w:t>බල්ලාව</w:t>
             </w:r>
-            <w:r>
-              <w:t xml:space="preserve"> </w:t>
-            </w:r>
+            <w:proofErr w:type="spellEnd"/>
+            <w:r>
+              <w:t xml:space="preserve"> </w:t>
+            </w:r>
+            <w:proofErr w:type="spellStart"/>
             <w:r>
               <w:rPr>
                 <w:rFonts w:ascii="Iskoola Pota" w:hAnsi="Iskoola Pota" w:cs="Iskoola Pota"/>
               </w:rPr>
               <w:t>දැක්කාද</w:t>
             </w:r>
+            <w:proofErr w:type="spellEnd"/>
             <w:r>
               <w:t>?</w:t>
             </w:r>
@@ -787,7 +915,7 @@
           <w:p>
             <w:pPr>
               <w:rPr>
-                <w:rFonts w:ascii="Iskoola Pota" w:hAnsi="Iskoola Pota" w:cs="Iskoola Pota" w:hint="cs"/>
+                <w:rFonts w:ascii="Iskoola Pota" w:hAnsi="Iskoola Pota" w:cs="Iskoola Pota"/>
               </w:rPr>
             </w:pPr>
           </w:p>
@@ -802,36 +930,44 @@
                 <w:rFonts w:ascii="Iskoola Pota" w:hAnsi="Iskoola Pota" w:cs="Iskoola Pota"/>
               </w:rPr>
             </w:pPr>
+            <w:proofErr w:type="spellStart"/>
             <w:r>
               <w:rPr>
                 <w:rFonts w:ascii="Iskoola Pota" w:hAnsi="Iskoola Pota" w:cs="Iskoola Pota" w:hint="cs"/>
               </w:rPr>
               <w:t>මල්ලී</w:t>
             </w:r>
-            <w:r>
-              <w:rPr>
-                <w:rFonts w:ascii="Iskoola Pota" w:hAnsi="Iskoola Pota" w:cs="Iskoola Pota"/>
-              </w:rPr>
-              <w:t xml:space="preserve"> </w:t>
-            </w:r>
+            <w:proofErr w:type="spellEnd"/>
+            <w:r>
+              <w:rPr>
+                <w:rFonts w:ascii="Iskoola Pota" w:hAnsi="Iskoola Pota" w:cs="Iskoola Pota"/>
+              </w:rPr>
+              <w:t xml:space="preserve"> </w:t>
+            </w:r>
+            <w:proofErr w:type="spellStart"/>
             <w:r>
               <w:rPr>
                 <w:rFonts w:ascii="Iskoola Pota" w:hAnsi="Iskoola Pota" w:cs="Iskoola Pota" w:hint="cs"/>
+                <w:b/>
+                <w:bCs/>
               </w:rPr>
               <w:t>බිල්ලාව</w:t>
             </w:r>
-            <w:r>
-              <w:rPr>
-                <w:rFonts w:ascii="Iskoola Pota" w:hAnsi="Iskoola Pota" w:cs="Iskoola Pota"/>
-              </w:rPr>
-              <w:t xml:space="preserve"> </w:t>
-            </w:r>
+            <w:proofErr w:type="spellEnd"/>
+            <w:r>
+              <w:rPr>
+                <w:rFonts w:ascii="Iskoola Pota" w:hAnsi="Iskoola Pota" w:cs="Iskoola Pota"/>
+              </w:rPr>
+              <w:t xml:space="preserve"> </w:t>
+            </w:r>
+            <w:proofErr w:type="spellStart"/>
             <w:r>
               <w:rPr>
                 <w:rFonts w:ascii="Iskoola Pota" w:hAnsi="Iskoola Pota" w:cs="Iskoola Pota" w:hint="cs"/>
               </w:rPr>
               <w:t>දැක්කාද</w:t>
             </w:r>
+            <w:proofErr w:type="spellEnd"/>
             <w:r>
               <w:rPr>
                 <w:rFonts w:ascii="Iskoola Pota" w:hAnsi="Iskoola Pota" w:cs="Iskoola Pota"/>

</xml_diff>